<commit_message>
Soru tipi kataloğu ekle; promptlara alt tip hedeflerini bağla
- 12-SORU-TIPI-KATALOGU (md + docx): 2021-2025 sınavlarının 500 sorusu
  39 alt tipe ve 9 biçim bayrağına ayrıldı. Her alt tip için 5 yıllık
  sayı, alan, kök kalıpları, gerçek sınavdan aynen örnek, doğru cevap
  ve çeldirici kurgusu, üretim tarifi; sınır durumlar; 100 soruluk
  deneme için alt tip reçetesi.
- 02-06 soru promptları: çağırma şablonuna ALT TİP alanı, alan bazlı
  alt tip hedefleri, Kalıp/Teknik satırında alt tip kodu. 06'daki hesap
  aileleri katalogdaki H kodlarıyla çakışmasın diye A1-A6 oldu.
- 01 analiz ve 02 genel prompt veriyle düzeltildi: doğru/bozuk şık
  uzunluğu, madde numarası sıklığı (~%8, dayanak amaçlı), dar anlamda
  güncellik (5 yılda 14), öncüllü cevap dağılımı, hesapta E nadirliği,
  2025'te bağlı soru olmaması.
- 07 mini test dağılımı ve 00-OKU-BENI güncellendi.

Co-Authored-By: Claude Opus 5.5 <noreply@anthropic.com>
Claude-Session: https://claude.ai/code/session_01GgDEz86kKogUAFjPuHAFPg
</commit_message>
<xml_diff>
--- a/00-SORU-YAZARI-ANALIZI-VE-PROMPTLAR/00-OKU-BENI.docx
+++ b/00-SORU-YAZARI-ANALIZI-VE-PROMPTLAR/00-OKU-BENI.docx
@@ -568,6 +568,57 @@
           </w:p>
         </w:tc>
       </w:tr>
+      <w:tr>
+        <w:tc>
+          <w:tcPr/>
+          <w:p>
+            <w:pPr>
+              <w:pStyle w:val="Compact"/>
+              <w:jc w:val="left"/>
+            </w:pPr>
+            <w:r>
+              <w:t xml:space="preserve">12</w:t>
+            </w:r>
+          </w:p>
+        </w:tc>
+        <w:tc>
+          <w:tcPr/>
+          <w:p>
+            <w:pPr>
+              <w:pStyle w:val="Compact"/>
+              <w:jc w:val="left"/>
+            </w:pPr>
+            <w:r>
+              <w:rPr>
+                <w:rStyle w:val="VerbatimChar"/>
+              </w:rPr>
+              <w:t xml:space="preserve">12-SORU-TIPI-KATALOGU</w:t>
+            </w:r>
+          </w:p>
+        </w:tc>
+        <w:tc>
+          <w:tcPr/>
+          <w:p>
+            <w:pPr>
+              <w:pStyle w:val="Compact"/>
+              <w:jc w:val="left"/>
+            </w:pPr>
+            <w:r>
+              <w:rPr>
+                <w:bCs/>
+                <w:b/>
+              </w:rPr>
+              <w:t xml:space="preserve">500 sorunun 39 alt tipe ayrılmış haritası:</w:t>
+            </w:r>
+            <w:r>
+              <w:t xml:space="preserve"> </w:t>
+            </w:r>
+            <w:r>
+              <w:t xml:space="preserve">her alt tipin 5 yıllık sayısı, alanı, kök kalıpları, gerçek sınavdan aynen örneği (49 soru), doğru cevap ve çeldirici kurgusu, üretim tarifi; sınır durumlar; 100 soruluk deneme için alt tip reçetesi</w:t>
+            </w:r>
+          </w:p>
+        </w:tc>
+      </w:tr>
     </w:tbl>
     <w:p>
       <w:pPr>
@@ -647,6 +698,21 @@
           <w:rStyle w:val="VerbatimChar"/>
         </w:rPr>
         <w:t xml:space="preserve">analiz/</w:t>
+      </w:r>
+      <w:r>
+        <w:t xml:space="preserve"> </w:t>
+      </w:r>
+      <w:r>
+        <w:t xml:space="preserve">klasöründedir. 500 sorunun alt tip etiketleri (CSV), yıl yıl örnek dosyaları ve etiket sözlüğü</w:t>
+      </w:r>
+      <w:r>
+        <w:t xml:space="preserve"> </w:t>
+      </w:r>
+      <w:r>
+        <w:rPr>
+          <w:rStyle w:val="VerbatimChar"/>
+        </w:rPr>
+        <w:t xml:space="preserve">analiz/soru-tipi/</w:t>
       </w:r>
       <w:r>
         <w:t xml:space="preserve"> </w:t>
@@ -777,6 +843,61 @@
     </w:p>
     <w:p>
       <w:pPr>
+        <w:numPr>
+          <w:ilvl w:val="0"/>
+          <w:numId w:val="1001"/>
+        </w:numPr>
+        <w:pStyle w:val="Compact"/>
+      </w:pPr>
+      <w:r>
+        <w:t xml:space="preserve">İstersen</w:t>
+      </w:r>
+      <w:r>
+        <w:t xml:space="preserve"> </w:t>
+      </w:r>
+      <w:r>
+        <w:rPr>
+          <w:bCs/>
+          <w:b/>
+        </w:rPr>
+        <w:t xml:space="preserve">ALT TİP</w:t>
+      </w:r>
+      <w:r>
+        <w:t xml:space="preserve"> </w:t>
+      </w:r>
+      <w:r>
+        <w:t xml:space="preserve">alanını doldur (ör.</w:t>
+      </w:r>
+      <w:r>
+        <w:t xml:space="preserve"> </w:t>
+      </w:r>
+      <w:r>
+        <w:rPr>
+          <w:rStyle w:val="VerbatimChar"/>
+        </w:rPr>
+        <w:t xml:space="preserve">O2×3, Ö3×2, B2×1</w:t>
+      </w:r>
+      <w:r>
+        <w:t xml:space="preserve">). Boş bırakılırsa</w:t>
+      </w:r>
+      <w:r>
+        <w:t xml:space="preserve"> </w:t>
+      </w:r>
+      <w:r>
+        <w:rPr>
+          <w:rStyle w:val="VerbatimChar"/>
+        </w:rPr>
+        <w:t xml:space="preserve">OTOMATİK</w:t>
+      </w:r>
+      <w:r>
+        <w:t xml:space="preserve"> </w:t>
+      </w:r>
+      <w:r>
+        <w:t xml:space="preserve">uygulanır: katalogdaki deneme reçetesi. Belirli bir tipte zorlanıyorsan katalogdaki gerçek örneği KALİBRASYON için promptun sonuna yapıştır.</w:t>
+      </w:r>
+    </w:p>
+    <w:p>
+      <w:pPr>
         <w:pStyle w:val="FirstParagraph"/>
       </w:pPr>
       <w:r>
@@ -959,7 +1080,7 @@
         <w:t xml:space="preserve"> </w:t>
       </w:r>
       <w:r>
-        <w:t xml:space="preserve">referansı, 3 bölümlü deneme formatı korundu. Kök tipi payları, doğru şıkkın uzunluk kuralı ve öncüllü cevap dağılımı 5 yıllık gerçek veriyle güncellendi.</w:t>
+        <w:t xml:space="preserve">referansı, 3 bölümlü deneme formatı korundu. Kök tipi payları, alt tip hedefleri, doğru şıkkın uzunluk kuralı ve öncüllü cevap dağılımı 5 yıllık gerçek veriyle güncellendi. Madde numarası ezberi yasağı korundu; gerçek sınavlarda numara ~%8 soruda yalnız dayanak olarak geçiyor.</w:t>
       </w:r>
     </w:p>
     <w:p>

</xml_diff>

<commit_message>
3 adet 100 soruluk deneme sınavı ekle (01-DENEME-SINAVLARI)
- Her deneme: 42 Gümrük Mevzuatı, 30 Sair Mevzuat, 17 Tarife, 11 Hesap;
  gerçek sınavların blok düzeni (2025, 2022, 2023), konu ağırlıkları ve
  soru tipi reçetesiyle. Her harf 20 kez doğru cevap.
- Soru kitapçığı ile cevap anahtarı ve açıklamalı çözümler ayrı
  dosyalarda (PDF, Word, Markdown); soruların makine verisi veri/ altında.
- Sorular 12 konu kümesinde depodaki mevzuat dosyalarına ve çıkmış
  soruların doğrulanmış ifadelerine dayanılarak üretildi, küme küme
  bağımsız doğrulamadan (244 değişmeden, 47 düzeltme, 9 yeniden yazım)
  ve deneme bazında çapraz kontrolden geçti.
- 00-OKU-BENI: kullanım, yapı, güncellik uyarıları (GK 241/1 AYM iptali,
  KDVK 21/ç, posta 2026 değişiklikleri vb.) ve sınırlılıklar.
- uretim-kayitlari/: plan, talimatlar, doğrulama raporları ve betikler.

Co-Authored-By: Claude Opus 5.5 <noreply@anthropic.com>
Claude-Session: https://claude.ai/code/session_01GgDEz86kKogUAFjPuHAFPg
</commit_message>
<xml_diff>
--- a/00-SORU-YAZARI-ANALIZI-VE-PROMPTLAR/00-OKU-BENI.docx
+++ b/00-SORU-YAZARI-ANALIZI-VE-PROMPTLAR/00-OKU-BENI.docx
@@ -656,6 +656,39 @@
       </w:r>
       <w:r>
         <w:t xml:space="preserve">(Word) sürümü vardır.</w:t>
+      </w:r>
+    </w:p>
+    <w:p>
+      <w:pPr>
+        <w:pStyle w:val="BodyText"/>
+      </w:pPr>
+      <w:r>
+        <w:rPr>
+          <w:bCs/>
+          <w:b/>
+        </w:rPr>
+        <w:t xml:space="preserve">Deneme sınavları:</w:t>
+      </w:r>
+      <w:r>
+        <w:t xml:space="preserve"> </w:t>
+      </w:r>
+      <w:r>
+        <w:t xml:space="preserve">Bu analizlere ve promptlara göre hazırlanmış, doğrulanmış 3 adet 100 soruluk deneme (soru kitapçığı, cevap anahtarı ve açıklamalı çözümler; PDF/Word)</w:t>
+      </w:r>
+      <w:r>
+        <w:t xml:space="preserve"> </w:t>
+      </w:r>
+      <w:r>
+        <w:rPr>
+          <w:rStyle w:val="VerbatimChar"/>
+        </w:rPr>
+        <w:t xml:space="preserve">../01-DENEME-SINAVLARI/</w:t>
+      </w:r>
+      <w:r>
+        <w:t xml:space="preserve"> </w:t>
+      </w:r>
+      <w:r>
+        <w:t xml:space="preserve">klasöründedir.</w:t>
       </w:r>
     </w:p>
     <w:p>

</xml_diff>